<commit_message>
Update test report and add temporary files for coverage analysis
</commit_message>
<xml_diff>
--- a/Scrubbing/Part2_Test_Report.docx
+++ b/Scrubbing/Part2_Test_Report.docx
@@ -1060,11 +1060,9 @@
             <w:hideMark/>
           </w:tcPr>
           <w:p>
-            <w:proofErr w:type="spellStart"/>
             <w:r>
               <w:t>DigitScrubber</w:t>
             </w:r>
-            <w:proofErr w:type="spellEnd"/>
           </w:p>
         </w:tc>
         <w:tc>
@@ -1116,11 +1114,9 @@
             <w:hideMark/>
           </w:tcPr>
           <w:p>
-            <w:proofErr w:type="spellStart"/>
             <w:r>
               <w:t>DigitScrubber</w:t>
             </w:r>
-            <w:proofErr w:type="spellEnd"/>
           </w:p>
         </w:tc>
         <w:tc>
@@ -1172,11 +1168,9 @@
             <w:hideMark/>
           </w:tcPr>
           <w:p>
-            <w:proofErr w:type="spellStart"/>
             <w:r>
               <w:t>DigitScrubber</w:t>
             </w:r>
-            <w:proofErr w:type="spellEnd"/>
           </w:p>
         </w:tc>
         <w:tc>
@@ -1228,11 +1222,9 @@
             <w:hideMark/>
           </w:tcPr>
           <w:p>
-            <w:proofErr w:type="spellStart"/>
             <w:r>
               <w:t>DigitScrubber</w:t>
             </w:r>
-            <w:proofErr w:type="spellEnd"/>
           </w:p>
         </w:tc>
         <w:tc>
@@ -1284,11 +1276,9 @@
             <w:hideMark/>
           </w:tcPr>
           <w:p>
-            <w:proofErr w:type="spellStart"/>
             <w:r>
               <w:t>EmailScrubber</w:t>
             </w:r>
-            <w:proofErr w:type="spellEnd"/>
           </w:p>
         </w:tc>
         <w:tc>
@@ -1340,11 +1330,9 @@
             <w:hideMark/>
           </w:tcPr>
           <w:p>
-            <w:proofErr w:type="spellStart"/>
             <w:r>
               <w:t>EmailScrubber</w:t>
             </w:r>
-            <w:proofErr w:type="spellEnd"/>
           </w:p>
         </w:tc>
         <w:tc>
@@ -1396,11 +1384,9 @@
             <w:hideMark/>
           </w:tcPr>
           <w:p>
-            <w:proofErr w:type="spellStart"/>
             <w:r>
               <w:t>EmailScrubber</w:t>
             </w:r>
-            <w:proofErr w:type="spellEnd"/>
           </w:p>
         </w:tc>
         <w:tc>
@@ -1441,7 +1427,10 @@
           </w:tcPr>
           <w:p>
             <w:r>
-              <w:t>TC10</w:t>
+              <w:t>TC</w:t>
+            </w:r>
+            <w:r>
+              <w:t>8</w:t>
             </w:r>
           </w:p>
         </w:tc>
@@ -1452,11 +1441,9 @@
             <w:hideMark/>
           </w:tcPr>
           <w:p>
-            <w:proofErr w:type="spellStart"/>
             <w:r>
               <w:t>MainScrubber</w:t>
             </w:r>
-            <w:proofErr w:type="spellEnd"/>
           </w:p>
         </w:tc>
         <w:tc>
@@ -1497,7 +1484,10 @@
           </w:tcPr>
           <w:p>
             <w:r>
-              <w:t>TC11</w:t>
+              <w:t>TC</w:t>
+            </w:r>
+            <w:r>
+              <w:t>9</w:t>
             </w:r>
           </w:p>
         </w:tc>
@@ -1508,11 +1498,9 @@
             <w:hideMark/>
           </w:tcPr>
           <w:p>
-            <w:proofErr w:type="spellStart"/>
             <w:r>
               <w:t>MainScrubber</w:t>
             </w:r>
-            <w:proofErr w:type="spellEnd"/>
           </w:p>
         </w:tc>
         <w:tc>
@@ -1553,7 +1541,10 @@
           </w:tcPr>
           <w:p>
             <w:r>
-              <w:t>TC12</w:t>
+              <w:t>TC1</w:t>
+            </w:r>
+            <w:r>
+              <w:t>0</w:t>
             </w:r>
           </w:p>
         </w:tc>
@@ -1564,11 +1555,9 @@
             <w:hideMark/>
           </w:tcPr>
           <w:p>
-            <w:proofErr w:type="spellStart"/>
             <w:r>
               <w:t>MainScrubber</w:t>
             </w:r>
-            <w:proofErr w:type="spellEnd"/>
           </w:p>
         </w:tc>
         <w:tc>
@@ -1609,7 +1598,10 @@
           </w:tcPr>
           <w:p>
             <w:r>
-              <w:t>TC13</w:t>
+              <w:t>TC1</w:t>
+            </w:r>
+            <w:r>
+              <w:t>1</w:t>
             </w:r>
           </w:p>
         </w:tc>
@@ -1620,11 +1612,9 @@
             <w:hideMark/>
           </w:tcPr>
           <w:p>
-            <w:proofErr w:type="spellStart"/>
             <w:r>
               <w:t>MainScrubber</w:t>
             </w:r>
-            <w:proofErr w:type="spellEnd"/>
           </w:p>
         </w:tc>
         <w:tc>
@@ -1659,10 +1649,7 @@
         <w:pStyle w:val="Heading1"/>
       </w:pPr>
       <w:r>
-        <w:t>5.</w:t>
-      </w:r>
-      <w:r>
-        <w:t xml:space="preserve"> Coverage Criteria</w:t>
+        <w:t>5. Coverage Criteria</w:t>
       </w:r>
     </w:p>
     <w:p>
@@ -2487,6 +2474,7 @@
   <w:style w:type="character" w:default="1" w:styleId="DefaultParagraphFont">
     <w:name w:val="Default Paragraph Font"/>
     <w:uiPriority w:val="1"/>
+    <w:semiHidden/>
     <w:unhideWhenUsed/>
   </w:style>
   <w:style w:type="table" w:default="1" w:styleId="TableNormal">

</xml_diff>